<commit_message>
Updated transcripts to replace specific company names with a placeholder for confidentiality and improved clarity in the dialogue.
</commit_message>
<xml_diff>
--- a/transcripts/Thesis interview Karin Boon.docx
+++ b/transcripts/Thesis interview Karin Boon.docx
@@ -79,7 +79,7 @@
           <w:i/>
           <w:iCs/>
         </w:rPr>
-        <w:t xml:space="preserve">AI day at Nyenrode later?</w:t>
+        <w:t xml:space="preserve">AI day at [company] later?</w:t>
       </w:r>
     </w:p>
     <w:p>
@@ -115,7 +115,7 @@
           <w:i/>
           <w:iCs/>
         </w:rPr>
-        <w:t xml:space="preserve">Are registrations picking up a bit for the AI session at Nyenrode?</w:t>
+        <w:t xml:space="preserve">Are registrations picking up a bit for the AI session at [company]?</w:t>
       </w:r>
     </w:p>
     <w:p>
@@ -143,29 +143,29 @@
         <w:t xml:space="preserve"> </w:t>
       </w:r>
       <w:r>
-        <w:t xml:space="preserve">Tell me, because I saw you, uh, you’re at Nyenrode and you also have your own company?</w:t>
-      </w:r>
-    </w:p>
-    <w:p>
-      <w:pPr>
-        <w:pStyle w:val="BlockText"/>
-      </w:pPr>
-      <w:r>
-        <w:rPr>
-          <w:i/>
-          <w:iCs/>
-        </w:rPr>
-        <w:t xml:space="preserve">[Me]</w:t>
-      </w:r>
-      <w:r>
-        <w:t xml:space="preserve"> </w:t>
-      </w:r>
-      <w:r>
-        <w:rPr>
-          <w:i/>
-          <w:iCs/>
-        </w:rPr>
-        <w:t xml:space="preserve">Uh, well, not, not my own company. I am on the, uh, management team at Techonomy. Uh, and I’m doing research for my thesis on the question: how can marketing managers extract value from AI?</w:t>
+        <w:t xml:space="preserve">Tell me, because I saw you, uh, you’re at [company] and you also have your own company?</w:t>
+      </w:r>
+    </w:p>
+    <w:p>
+      <w:pPr>
+        <w:pStyle w:val="BlockText"/>
+      </w:pPr>
+      <w:r>
+        <w:rPr>
+          <w:i/>
+          <w:iCs/>
+        </w:rPr>
+        <w:t xml:space="preserve">[Me]</w:t>
+      </w:r>
+      <w:r>
+        <w:t xml:space="preserve"> </w:t>
+      </w:r>
+      <w:r>
+        <w:rPr>
+          <w:i/>
+          <w:iCs/>
+        </w:rPr>
+        <w:t xml:space="preserve">Uh, well, not, not my own company. I am on the, uh, management team at [company]. Uh, and I’m doing research for my thesis on the question: how can marketing managers extract value from AI?</w:t>
       </w:r>
     </w:p>
     <w:p>
@@ -201,7 +201,7 @@
           <w:i/>
           <w:iCs/>
         </w:rPr>
-        <w:t xml:space="preserve">That’s why I wanted to talk to you. And I also think it would be really nice to keep talking about, I don’t know, the whole AI community, uh, within Nyenrode. I’ll probably also join the DDMA for their, their AI club, the Dutch one, what does it actually stand for, DDMA? Data Driven Marketing Association. That’s the one.</w:t>
+        <w:t xml:space="preserve">That’s why I wanted to talk to you. And I also think it would be really nice to keep talking about, I don’t know, the whole AI community, uh, within [company]. I’ll probably also join the [company] for their, their AI club, the Dutch one, what does it actually stand for, [company]? [company]. That’s the one.</w:t>
       </w:r>
     </w:p>
     <w:p>
@@ -381,7 +381,7 @@
           <w:i/>
           <w:iCs/>
         </w:rPr>
-        <w:t xml:space="preserve">Techonomy is a digital marketing agency, actually increasingly full service, so really from content to the, the infrastructure where we connect all your different marketing applications, your Salesforce or email system or whatever you have in your organization. Make sure it’s set up in your organization so your marketers can work with it. So there’s often a bit of change management involved too.</w:t>
+        <w:t xml:space="preserve">[company] is a digital marketing agency, actually increasingly full service, so really from content to the, the infrastructure where we connect all your different marketing applications, your Salesforce or email system or whatever you have in your organization. Make sure it’s set up in your organization so your marketers can work with it. So there’s often a bit of change management involved too.</w:t>
       </w:r>
     </w:p>
     <w:p>
@@ -443,7 +443,7 @@
         <w:t xml:space="preserve"> </w:t>
       </w:r>
       <w:r>
-        <w:t xml:space="preserve">Yeah, uh, I started seventeen years ago as, uh, my own marketing agency, Boni Agency. Uh, my background is, uh, actually, uh, partly in the media landscape where I worked. And I worked at KPN, uh, where I was always at the intersection of marketing and sales. So, uh, worked a lot with trade marketers of course. And, uh, yeah, actually experienced marketing at the very highest level. So, uh, really great.</w:t>
+        <w:t xml:space="preserve">Yeah, uh, I started seventeen years ago as, uh, my own marketing agency, [company]. Uh, my background is, uh, actually, uh, partly in the media landscape where I worked. And I worked at [company], uh, where I was always at the intersection of marketing and sales. So, uh, worked a lot with trade marketers of course. And, uh, yeah, actually experienced marketing at the very highest level. So, uh, really great.</w:t>
       </w:r>
     </w:p>
     <w:p>
@@ -467,7 +467,7 @@
         <w:pStyle w:val="BodyText"/>
       </w:pPr>
       <w:r>
-        <w:t xml:space="preserve">Uhm, so then I started Boni Agency and, uhm, yeah, funny enough the competitors I, uhm, uhm, had in my, uh, market as, uhm, a distributor then asked me: okay, do you want to do the marketing for us? So, uh, that’s really funny how that goes. So, uh, I represented a lot of brands in the baby market for a long time.</w:t>
+        <w:t xml:space="preserve">Uhm, so then I started [company] and, uhm, yeah, funny enough the competitors I, uhm, uhm, had in my, uh, market as, uhm, a distributor then asked me: okay, do you want to do the marketing for us? So, uh, that’s really funny how that goes. So, uh, I represented a lot of brands in the baby market for a long time.</w:t>
       </w:r>
     </w:p>
     <w:p>
@@ -507,7 +507,7 @@
         <w:pStyle w:val="BodyText"/>
       </w:pPr>
       <w:r>
-        <w:t xml:space="preserve">So that’s where Lady AI came from. So that’s the nutshell version.</w:t>
+        <w:t xml:space="preserve">So that’s where [company] came from. So that’s the nutshell version.</w:t>
       </w:r>
     </w:p>
     <w:p>
@@ -593,15 +593,15 @@
         <w:t xml:space="preserve"> </w:t>
       </w:r>
       <w:r>
-        <w:t xml:space="preserve">So I immediately, eh, secured everything and, eh, yeah, really great. But that, that was just, yeah, when you’re one of the first innovators, yeah, then, eh, it goes fast of course. And, ehm, yeah, where am I now? Ehm, I give a lot of trainings. I’m a permanent trainer at Unica. Large organization where I focus heavily on Copilot. Eh, and also, yeah, actually, eh, what does AI mean for your company, for your team, for your marketing team, for the executive board.</w:t>
-      </w:r>
-    </w:p>
-    <w:p>
-      <w:pPr>
-        <w:pStyle w:val="BodyText"/>
-      </w:pPr>
-      <w:r>
-        <w:t xml:space="preserve">So then I’m really talking about AI integration. Ehm, the Nuvo, the optician industry association, I do the same there. Every month I’m there for a class of opticians, optometrists. Ehm, and in between I speak at a lot of nice venues, eh, I also work for, eh, Workmode in Amsterdam, eh, where I have fixed, eh, moments when I collaborate with them.</w:t>
+        <w:t xml:space="preserve">So I immediately, eh, secured everything and, eh, yeah, really great. But that, that was just, yeah, when you’re one of the first innovators, yeah, then, eh, it goes fast of course. And, ehm, yeah, where am I now? Ehm, I give a lot of trainings. I’m a permanent trainer at [company]. Large organization where I focus heavily on Copilot. Eh, and also, yeah, actually, eh, what does AI mean for your company, for your team, for your marketing team, for the executive board.</w:t>
+      </w:r>
+    </w:p>
+    <w:p>
+      <w:pPr>
+        <w:pStyle w:val="BodyText"/>
+      </w:pPr>
+      <w:r>
+        <w:t xml:space="preserve">So then I’m really talking about AI integration. Ehm, the [company], the optician industry association, I do the same there. Every month I’m there for a class of opticians, optometrists. Ehm, and in between I speak at a lot of nice venues, eh, I also work for, eh, [company] in [redacted], eh, where I have fixed, eh, moments when I collaborate with them.</w:t>
       </w:r>
     </w:p>
     <w:p>
@@ -617,7 +617,7 @@
         <w:pStyle w:val="BodyText"/>
       </w:pPr>
       <w:r>
-        <w:t xml:space="preserve">So, ehm, I just set up my, ehm, my voice agent completely, ehm, linked to my phone for when I’m not there myself. You know, all that kind of thing. So I try to think very much from that perspective, eh. Eh, and I work with a team of engineers, eh, also in Ukraine. And we’re developing our own marketing product, eh, but I can’t say much about that yet because that, eh, yeah.</w:t>
+        <w:t xml:space="preserve">So, ehm, I just set up my, ehm, my voice agent completely, ehm, linked to my phone for when I’m not there myself. You know, all that kind of thing. So I try to think very much from that perspective, eh. Eh, and I work with a team of engineers, eh, also in [redacted]. And we’re developing our own marketing product, eh, but I can’t say much about that yet because that, eh, yeah.</w:t>
       </w:r>
     </w:p>
     <w:p>
@@ -757,31 +757,31 @@
         <w:t xml:space="preserve"> </w:t>
       </w:r>
       <w:r>
-        <w:t xml:space="preserve">Ehm. Yeah, what is doing well, right? Ehm, dealing with AI in the right way. When it comes to image creation I mainly see that with the AI engineers who design it, who show their cases. And I don’t really see it as much in brands, because Coca-Cola made a really beautiful video last year and, well, that sparked a lot of discussion.</w:t>
-      </w:r>
-    </w:p>
-    <w:p>
-      <w:pPr>
-        <w:pStyle w:val="BodyText"/>
-      </w:pPr>
-      <w:r>
-        <w:t xml:space="preserve">Ehm, I see a video, I don’t really see the ultimate video emerging there yet where real distinction is offered. Eh, I think that brands that do it well have found a kind of hybrid form of AI image and non-AI image. But I can’t really point to, ehm, that brand is doing really well. Look, I see Cartier is a nice example there. They developed a beautiful image with, with AI.</w:t>
-      </w:r>
-    </w:p>
-    <w:p>
-      <w:pPr>
-        <w:pStyle w:val="BodyText"/>
-      </w:pPr>
-      <w:r>
-        <w:t xml:space="preserve">Based on the images they already had, so that was the panther from Panthere of the brand they have, they developed the panthers and those, those became AI images that the brand really embraces. But in that you already see that there’s an existing concept being further developed, which saves costs. So I do see a lot of things emerging there. And in the fashion industry that’s generally really strong, I think.</w:t>
-      </w:r>
-    </w:p>
-    <w:p>
-      <w:pPr>
-        <w:pStyle w:val="BodyText"/>
-      </w:pPr>
-      <w:r>
-        <w:t xml:space="preserve">So Mango does that, Zara does it. So they mainly look at how they can save costs on models and on, on a bit of creativity based on their existing concepts. And there, yeah, that’s what I see.</w:t>
+        <w:t xml:space="preserve">Ehm. Yeah, what is doing well, right? Ehm, dealing with AI in the right way. When it comes to image creation I mainly see that with the AI engineers who design it, who show their cases. And I don’t really see it as much in brands, because [company] made a really beautiful video last year and, well, that sparked a lot of discussion.</w:t>
+      </w:r>
+    </w:p>
+    <w:p>
+      <w:pPr>
+        <w:pStyle w:val="BodyText"/>
+      </w:pPr>
+      <w:r>
+        <w:t xml:space="preserve">Ehm, I see a video, I don’t really see the ultimate video emerging there yet where real distinction is offered. Eh, I think that brands that do it well have found a kind of hybrid form of AI image and non-AI image. But I can’t really point to, ehm, that brand is doing really well. Look, I see [company] is a nice example there. They developed a beautiful image with, with AI.</w:t>
+      </w:r>
+    </w:p>
+    <w:p>
+      <w:pPr>
+        <w:pStyle w:val="BodyText"/>
+      </w:pPr>
+      <w:r>
+        <w:t xml:space="preserve">Based on the images they already had, so that was the panther from [company] of the brand they have, they developed the panthers and those, those became AI images that the brand really embraces. But in that you already see that there’s an existing concept being further developed, which saves costs. So I do see a lot of things emerging there. And in the fashion industry that’s generally really strong, I think.</w:t>
+      </w:r>
+    </w:p>
+    <w:p>
+      <w:pPr>
+        <w:pStyle w:val="BodyText"/>
+      </w:pPr>
+      <w:r>
+        <w:t xml:space="preserve">So [company] does that, [company] does it. So they mainly look at how they can save costs on models and on, on a bit of creativity based on their existing concepts. And there, yeah, that’s what I see.</w:t>
       </w:r>
     </w:p>
     <w:p>
@@ -1045,7 +1045,7 @@
         <w:pStyle w:val="BodyText"/>
       </w:pPr>
       <w:r>
-        <w:t xml:space="preserve">I really see there, and that naturally has to do with change management. And, and change management. Yeah, that’s just how it is. I saw that at KPN. From old to new KPN. That just took several years. And Elon Musk already said, and I think it was last week or the week before, he already said okay, every company could now run on eighty percent with AI. But before we get there yeah, startups can start directly from AI.</w:t>
+        <w:t xml:space="preserve">I really see there, and that naturally has to do with change management. And, and change management. Yeah, that’s just how it is. I saw that at [company]. From old to new [company]. That just took several years. And [person] already said, and I think it was last week or the week before, he already said okay, every company could now run on eighty percent with AI. But before we get there yeah, startups can start directly from AI.</w:t>
       </w:r>
     </w:p>
     <w:p>
@@ -1285,7 +1285,7 @@
         <w:t xml:space="preserve"> </w:t>
       </w:r>
       <w:r>
-        <w:t xml:space="preserve">Eh, I think a really big one. Because tech people stay tech people. With all respect, but, ehm, I think that I myself, ehm, ehm, I used to work for a web agency, for example. I built really large websites costing more than a hundred thousand for companies like Salama and that kind of thing. And look, tech people still, ehm, I think the future tech person won’t even fit in a unit of tech person.</w:t>
+        <w:t xml:space="preserve">Eh, I think a really big one. Because tech people stay tech people. With all respect, but, ehm, I think that I myself, ehm, ehm, I used to work for a web agency, for example. I built really large websites costing more than a hundred thousand for companies like [company] and that kind of thing. And look, tech people still, ehm, I think the future tech person won’t even fit in a unit of tech person.</w:t>
       </w:r>
     </w:p>
     <w:p>
@@ -1563,7 +1563,7 @@
           <w:i/>
           <w:iCs/>
         </w:rPr>
-        <w:t xml:space="preserve">Definitely yeah. And there’s also still publishing. Stephanie has already told everyone I’m going to do that. I don’t know yet.</w:t>
+        <w:t xml:space="preserve">Definitely yeah. And there’s also still publishing. [person] has already told everyone I’m going to do that. I don’t know yet.</w:t>
       </w:r>
     </w:p>
     <w:p>
@@ -1733,7 +1733,7 @@
         <w:t xml:space="preserve"> </w:t>
       </w:r>
       <w:r>
-        <w:t xml:space="preserve">Yeah, yeah. Or just ask how, uhm, uh, how Nyenrode can do that for you.</w:t>
+        <w:t xml:space="preserve">Yeah, yeah. Or just ask how, uhm, uh, how [company] can do that for you.</w:t>
       </w:r>
     </w:p>
     <w:p>
@@ -1769,29 +1769,29 @@
         <w:t xml:space="preserve"> </w:t>
       </w:r>
       <w:r>
-        <w:t xml:space="preserve">Because, uh, I’d definitely do that, because I, I recently spoke to someone from Nyenrode. I’ve forgotten his name and he’s really into that there, so, uh, I’d just frame that question differently.</w:t>
-      </w:r>
-    </w:p>
-    <w:p>
-      <w:pPr>
-        <w:pStyle w:val="BlockText"/>
-      </w:pPr>
-      <w:r>
-        <w:rPr>
-          <w:i/>
-          <w:iCs/>
-        </w:rPr>
-        <w:t xml:space="preserve">[Me]</w:t>
-      </w:r>
-      <w:r>
-        <w:t xml:space="preserve"> </w:t>
-      </w:r>
-      <w:r>
-        <w:rPr>
-          <w:i/>
-          <w:iCs/>
-        </w:rPr>
-        <w:t xml:space="preserve">I, I sometimes give guest lectures for TIAS. I find that super fun, but it also feels really weird to have studied at Nyenrode and then give guest lectures at TIAS instead of Nyenrode. You know?</w:t>
+        <w:t xml:space="preserve">Because, uh, I’d definitely do that, because I, I recently spoke to someone from [company]. I’ve forgotten his name and he’s really into that there, so, uh, I’d just frame that question differently.</w:t>
+      </w:r>
+    </w:p>
+    <w:p>
+      <w:pPr>
+        <w:pStyle w:val="BlockText"/>
+      </w:pPr>
+      <w:r>
+        <w:rPr>
+          <w:i/>
+          <w:iCs/>
+        </w:rPr>
+        <w:t xml:space="preserve">[Me]</w:t>
+      </w:r>
+      <w:r>
+        <w:t xml:space="preserve"> </w:t>
+      </w:r>
+      <w:r>
+        <w:rPr>
+          <w:i/>
+          <w:iCs/>
+        </w:rPr>
+        <w:t xml:space="preserve">I, I sometimes give guest lectures for [company]. I find that super fun, but it also feels really weird to have studied at [company] and then give guest lectures at [company] instead of [company]. You know?</w:t>
       </w:r>
     </w:p>
     <w:p>
@@ -1913,7 +1913,7 @@
         <w:t xml:space="preserve"> </w:t>
       </w:r>
       <w:r>
-        <w:t xml:space="preserve">Okay, thanks Daan. Have a good day. Bye! Yeah.</w:t>
+        <w:t xml:space="preserve">Okay, thanks [person]. Have a good day. Bye! Yeah.</w:t>
       </w:r>
     </w:p>
     <w:sectPr>

</xml_diff>